<commit_message>
Inland transport A03–A05 v02: the Head of QC's answers of 13.10.2026
Branded, unnumbered tape and door seal (initialled joints stay the
integrity evidence); the carrier's own USB logger in every vehicle
recorded beside Purely Plant's, the climate unit's display having no
printout; the counter-sample / retention-sample carton carries a box
No. in its batch's n/N sequence; house terms контра мостри and
ретенциони мостри. The glossary gains "counter samples" with a lint on
the hyphenated form.

Co-Authored-By: Claude Fable 5.1 <noreply@anthropic.com>
Claude-Session: https://claude.ai/code/session_01MmMGVFtvBKMWjhXXkehRct
</commit_message>
<xml_diff>
--- a/deliverables/inland_transport_2026-10/v02_2026-10-13/docx/WHSOP_003_A03.docx
+++ b/deliverables/inland_transport_2026-10/v02_2026-10-13/docx/WHSOP_003_A03.docx
@@ -261,7 +261,7 @@
           <w:color w:val="000000"/>
           <w:sz w:val="22"/>
         </w:rPr>
-        <w:t>Затворање: не се користи серијализирана лента. Картонот се затвора со лента за затворање, а двете лица го парафираат и датираат спојот на лентата преку лентата и картонот; крајот на фолијата на палетата се затвора исто така. Парафиран спој што е цел е доказот за интегритет на картонот и палетата; прекинат или пречкртан спој се евидентира како отстапување.</w:t>
+        <w:t>Затворање: лентата и пломбите се брендирани со податоците на компанијата и не се нумерирани. Картонот се затвора со брендирана лента, а двете лица го парафираат и датираат спојот преку лентата и картонот; крајот на фолијата на палетата се затвора исто така. Цела брендирана лента со цел парафиран спој е доказот за интегритет на картонот и палетата; прекинат, прелепен или пречкртан спој се евидентира како отстапување.</w:t>
       </w:r>
       <w:r>
         <w:rPr>
@@ -281,7 +281,7 @@
           <w:color w:val="595959"/>
           <w:sz w:val="16"/>
         </w:rPr>
-        <w:t>Closure: no serialised tape is used. The carton is closed with closure tape and both persons initial and date the tape joint across the tape and the carton; the film end of the pallet is closed in the same way. An intact initialled joint is the evidence of integrity of the carton and the pallet; a broken or overwritten joint is recorded as a deviation.</w:t>
+        <w:t>Closure: the tape and the seals are branded with the company's details and are not numbered. The carton is closed with branded tape and both persons initial and date the joint across the tape and the carton; the film end of the pallet is closed in the same way. Intact branded tape with an intact initialled joint is the evidence of integrity of the carton and the pallet; a broken, over-taped or overwritten joint is recorded as a deviation.</w:t>
       </w:r>
     </w:p>
     <w:p>
@@ -297,7 +297,7 @@
           <w:color w:val="000000"/>
           <w:sz w:val="22"/>
         </w:rPr>
-        <w:t>Мешани палети: една палета може да носи картони од повеќе од една серија. Секој картон се запишува со својата серија и картон бр., а листата на пакување на палетата дава збир по серија (§5). Картонот со контра-мостри (КМ) е еден картон на палета од својата серија, со своја листа на пакување (§7) и ознака „КМ“ на листата на пакување на палетата, на етикетата на палетата и во манифестот (A04).</w:t>
+        <w:t>Мешани палети: една палета може да носи картони од повеќе од една серија. Секој картон се запишува со својата серија и картон бр., а листата на пакување на палетата дава збир по серија (§5). Картонот со контра мостри / ретенциони мостри (КМ) е еден картон на палета од својата серија, носи картон бр. во низата n / N на серијата, има своја листа на пакување (§7, подготвена од КК; бројот и масата на мострите влегуваат во вкупната количина во A02, A04 и A06) и ознака „КМ“ на листата на пакување на палетата, на етикетата на палетата и во манифестот (A04).</w:t>
       </w:r>
       <w:r>
         <w:rPr>
@@ -317,7 +317,7 @@
           <w:color w:val="595959"/>
           <w:sz w:val="16"/>
         </w:rPr>
-        <w:t>Mixed pallets: one pallet may carry cartons of more than one batch. Each carton is recorded with its batch and box No., and the pallet packing list gives a sub-total per batch (§5). The counter-sample carton (CS) is one carton on a pallet of its batch, with its own packing list (§7) and the mark "CS" on the pallet packing list, on the pallet label and in the manifest (A04).</w:t>
+        <w:t>Mixed pallets: one pallet may carry cartons of more than one batch. Each carton is recorded with its batch and box No., and the pallet packing list gives a sub-total per batch (§5). The counter-sample / retention-sample carton (CS) is one carton on a pallet of its batch, carries a box No. in the batch's n / N sequence, has its own packing list (§7, prepared by QC; the number and mass of the samples count in the total quantity in A02, A04 and A06) and the mark "CS" on the pallet packing list, on the pallet label and in the manifest (A04).</w:t>
       </w:r>
     </w:p>
     <w:p>
@@ -1004,7 +1004,7 @@
                 <w:color w:val="000000"/>
                 <w:sz w:val="18"/>
               </w:rPr>
-              <w:t>Етикета на картон со контра-мостри (КМ)</w:t>
+              <w:t>Етикета на картон со контра мостри (КМ)</w:t>
             </w:r>
             <w:r>
               <w:rPr>
@@ -1048,7 +1048,7 @@
                 <w:color w:val="000000"/>
                 <w:sz w:val="18"/>
               </w:rPr>
-              <w:t>како етикета на картон + „КОНТРА-МОСТРИ“; број на контејнери; нето маса на мострите</w:t>
+              <w:t>како етикета на картон + „КОНТРА МОСТРИ“; број на контејнери; нето маса на мострите</w:t>
             </w:r>
             <w:r>
               <w:rPr>
@@ -1149,7 +1149,7 @@
                 <w:color w:val="000000"/>
                 <w:sz w:val="18"/>
               </w:rPr>
-              <w:t>Етикета на контејнер со контра-мостра</w:t>
+              <w:t>Етикета на контејнер со контра мостра</w:t>
             </w:r>
             <w:r>
               <w:rPr>
@@ -1193,7 +1193,7 @@
                 <w:color w:val="000000"/>
                 <w:sz w:val="18"/>
               </w:rPr>
-              <w:t>серија (лот); P серија; нето маса; за: купувач / продавач на мало; датум; „КОНТРА-МОСТРА“</w:t>
+              <w:t>серија (лот); P серија; нето маса; вид: контра мостра / ретенциона мостра; за: купувач / продавач на мало; датум</w:t>
             </w:r>
             <w:r>
               <w:rPr>
@@ -1213,7 +1213,7 @@
                 <w:color w:val="000000"/>
                 <w:sz w:val="14"/>
               </w:rPr>
-              <w:t>batch (lot); P lot; net mass; for: buyer / retailer; date; "COUNTER SAMPLE"</w:t>
+              <w:t>batch (lot); P lot; net mass; type: counter sample / retention sample; for: buyer / retailer; date</w:t>
             </w:r>
           </w:p>
         </w:tc>
@@ -1634,7 +1634,7 @@
                 <w:color w:val="2B547E"/>
                 <w:sz w:val="18"/>
               </w:rPr>
-              <w:t>✎ Место за пример-етикета на картон со контра-мостри (КМ)</w:t>
+              <w:t>✎ Место за пример-етикета на картон со контра мостри (КМ)</w:t>
             </w:r>
             <w:r>
               <w:rPr>
@@ -1705,7 +1705,7 @@
                 <w:color w:val="2B547E"/>
                 <w:sz w:val="18"/>
               </w:rPr>
-              <w:t>✎ Место за пример-етикета на контејнер со контра-мостра</w:t>
+              <w:t>✎ Место за пример-етикета на контејнер со контра мостра</w:t>
             </w:r>
             <w:r>
               <w:rPr>
@@ -1794,7 +1794,7 @@
           <w:color w:val="000000"/>
           <w:sz w:val="22"/>
         </w:rPr>
-        <w:t>Една листа по картон; се печати на оваа страница, се пополнува при пакувањето и се става во проѕирна плика на картонот; копија во досието. За картонот со контра-мостри се користи §7.</w:t>
+        <w:t>Една листа по картон; се печати на оваа страница, се пополнува при пакувањето и се става во проѕирна плика на картонот; копија во досието. За картонот со контра мостри се користи §7.</w:t>
       </w:r>
       <w:r>
         <w:rPr>
@@ -3528,7 +3528,7 @@
                 <w:color w:val="000000"/>
                 <w:sz w:val="20"/>
               </w:rPr>
-              <w:t>Спојот на лентата парафиран и датиран од двете лица</w:t>
+              <w:t>Брендирана лента; спојот парафиран и датиран од двете лица</w:t>
             </w:r>
             <w:r>
               <w:rPr>
@@ -3548,7 +3548,7 @@
                 <w:color w:val="000000"/>
                 <w:sz w:val="16"/>
               </w:rPr>
-              <w:t>Tape joint initialled and dated by both persons</w:t>
+              <w:t>Branded tape; joint initialled and dated by both persons</w:t>
             </w:r>
           </w:p>
         </w:tc>
@@ -6222,7 +6222,7 @@
           <w:color w:val="000000"/>
           <w:sz w:val="22"/>
         </w:rPr>
-        <w:t>Вид: П — производ (кеси); КМ — контра-мостри (листа §7).</w:t>
+        <w:t>Вид: П — производ (кеси); КМ — контра мостри (листа §7).</w:t>
       </w:r>
       <w:r>
         <w:rPr>
@@ -7158,7 +7158,7 @@
                 <w:color w:val="000000"/>
                 <w:sz w:val="20"/>
               </w:rPr>
-              <w:t>Крајот на фолијата затворен со лента, парафиран и датиран од двете лица</w:t>
+              <w:t>Крајот на фолијата затворен со брендирана лента, парафиран и датиран од двете лица</w:t>
             </w:r>
             <w:r>
               <w:rPr>
@@ -7178,7 +7178,7 @@
                 <w:color w:val="000000"/>
                 <w:sz w:val="16"/>
               </w:rPr>
-              <w:t>Film end closed with tape, initialled and dated by both persons</w:t>
+              <w:t>Film end closed with branded tape, initialled and dated by both persons</w:t>
             </w:r>
           </w:p>
         </w:tc>
@@ -7700,9 +7700,10 @@
       </w:tr>
     </w:tbl>
     <w:p>
-      <w:r>
-        <w:br w:type="page"/>
-      </w:r>
+      <w:pPr>
+        <w:keepNext w:val="0"/>
+        <w:spacing w:before="0" w:after="0" w:lineRule="exact" w:line="240"/>
+      </w:pPr>
     </w:p>
     <w:p>
       <w:pPr>
@@ -8341,7 +8342,7 @@
           <w:color w:val="FFFFFF"/>
           <w:sz w:val="22"/>
         </w:rPr>
-        <w:t>7 Листа на пакување на картонот со контра-мостри (КМ)</w:t>
+        <w:t>7 Листа на пакување на картонот со контра мостри / ретенциони мостри (КМ)</w:t>
       </w:r>
       <w:r>
         <w:rPr>
@@ -8361,50 +8362,13 @@
           <w:color w:val="FFFFFF"/>
           <w:sz w:val="18"/>
         </w:rPr>
-        <w:t>Counter-sample carton (CS) packing list</w:t>
+        <w:t>Counter-sample / retention-sample carton (CS) packing list</w:t>
       </w:r>
     </w:p>
     <w:p>
       <w:pPr>
         <w:keepNext/>
-        <w:spacing w:before="0" w:after="0" w:line="250" w:lineRule="auto"/>
-        <w:jc w:val="both"/>
-      </w:pPr>
-      <w:r>
-        <w:rPr>
-          <w:rFonts w:ascii="Calibri" w:hAnsi="Calibri"/>
-          <w:b w:val="0"/>
-          <w:i w:val="0"/>
-          <w:color w:val="000000"/>
-          <w:sz w:val="22"/>
-        </w:rPr>
-        <w:t>Контра-мострите за купувачот и за продавачот на мало ги подготвува КК според договорот; картонот КМ патува на палета од својата серија и се брои како картон на секоја точка на предавање. Бројот и масата на мострите се вклучени во вкупната количина во A02, A04 и A06.</w:t>
-      </w:r>
-      <w:r>
-        <w:rPr>
-          <w:rFonts w:ascii="Calibri" w:hAnsi="Calibri"/>
-          <w:b w:val="0"/>
-          <w:i w:val="0"/>
-          <w:color w:val="595959"/>
-          <w:sz w:val="16"/>
-        </w:rPr>
-        <w:t xml:space="preserve">  |  </w:t>
-      </w:r>
-      <w:r>
-        <w:rPr>
-          <w:rFonts w:ascii="Calibri" w:hAnsi="Calibri"/>
-          <w:b w:val="0"/>
-          <w:i/>
-          <w:color w:val="595959"/>
-          <w:sz w:val="16"/>
-        </w:rPr>
-        <w:t>The counter samples for the buyer and the retailer are prepared by QC per the contract; the CS carton travels on a pallet of its batch and is counted as a carton at every transfer point. The number and mass of the samples are included in the total quantity in A02, A04 and A06.</w:t>
-      </w:r>
-    </w:p>
-    <w:p>
-      <w:pPr>
-        <w:keepNext/>
-        <w:spacing w:before="0" w:after="0" w:lineRule="exact" w:line="120"/>
+        <w:spacing w:before="0" w:after="0" w:lineRule="exact" w:line="40"/>
       </w:pPr>
     </w:p>
     <w:tbl>
@@ -8740,8 +8704,10 @@
         </w:tblBorders>
       </w:tblPr>
       <w:tblGrid>
+        <w:gridCol w:w="3288"/>
+        <w:gridCol w:w="2126"/>
         <w:gridCol w:w="2925"/>
-        <w:gridCol w:w="7541"/>
+        <w:gridCol w:w="2126"/>
       </w:tblGrid>
       <w:tr>
         <w:trPr>
@@ -8751,6 +8717,73 @@
           <w:tcPr>
             <w:shd w:val="clear" w:color="auto" w:fill="F2F2F2"/>
             <w:vAlign w:val="center"/>
+            <w:tcW w:type="pct" w:w="1570"/>
+          </w:tcPr>
+          <w:p>
+            <w:pPr>
+              <w:spacing w:before="20" w:after="20"/>
+              <w:jc w:val="left"/>
+            </w:pPr>
+            <w:r/>
+            <w:r>
+              <w:rPr>
+                <w:rFonts w:ascii="Calibri" w:hAnsi="Calibri"/>
+                <w:b/>
+                <w:i w:val="0"/>
+                <w:color w:val="000000"/>
+                <w:sz w:val="20"/>
+              </w:rPr>
+              <w:t>Картон бр. n / N од серијата</w:t>
+            </w:r>
+            <w:r>
+              <w:rPr>
+                <w:rFonts w:ascii="Calibri" w:hAnsi="Calibri"/>
+                <w:b w:val="0"/>
+                <w:i w:val="0"/>
+                <w:color w:val="000000"/>
+                <w:sz w:val="16"/>
+              </w:rPr>
+              <w:t xml:space="preserve"> | </w:t>
+            </w:r>
+            <w:r>
+              <w:rPr>
+                <w:rFonts w:ascii="Calibri" w:hAnsi="Calibri"/>
+                <w:b w:val="0"/>
+                <w:i w:val="0"/>
+                <w:color w:val="000000"/>
+                <w:sz w:val="16"/>
+              </w:rPr>
+              <w:t>Box No. n / N of the batch</w:t>
+            </w:r>
+          </w:p>
+        </w:tc>
+        <w:tc>
+          <w:tcPr>
+            <w:vAlign w:val="center"/>
+            <w:tcW w:type="pct" w:w="1015"/>
+          </w:tcPr>
+          <w:p>
+            <w:pPr>
+              <w:spacing w:before="20" w:after="20"/>
+              <w:jc w:val="center"/>
+            </w:pPr>
+            <w:r/>
+            <w:r>
+              <w:rPr>
+                <w:rFonts w:ascii="Calibri" w:hAnsi="Calibri"/>
+                <w:b w:val="0"/>
+                <w:i w:val="0"/>
+                <w:color w:val="000000"/>
+                <w:sz w:val="20"/>
+              </w:rPr>
+              <w:t>___ / ___</w:t>
+            </w:r>
+          </w:p>
+        </w:tc>
+        <w:tc>
+          <w:tcPr>
+            <w:shd w:val="clear" w:color="auto" w:fill="F2F2F2"/>
+            <w:vAlign w:val="center"/>
             <w:tcW w:type="pct" w:w="1397"/>
           </w:tcPr>
           <w:p>
@@ -8794,7 +8827,7 @@
         <w:tc>
           <w:tcPr>
             <w:vAlign w:val="center"/>
-            <w:tcW w:type="pct" w:w="3602"/>
+            <w:tcW w:type="pct" w:w="1015"/>
           </w:tcPr>
           <w:p>
             <w:pPr>
@@ -8829,11 +8862,12 @@
         </w:tblBorders>
       </w:tblPr>
       <w:tblGrid>
-        <w:gridCol w:w="3707"/>
-        <w:gridCol w:w="1783"/>
-        <w:gridCol w:w="1854"/>
-        <w:gridCol w:w="1266"/>
-        <w:gridCol w:w="1854"/>
+        <w:gridCol w:w="3666"/>
+        <w:gridCol w:w="1434"/>
+        <w:gridCol w:w="1612"/>
+        <w:gridCol w:w="1413"/>
+        <w:gridCol w:w="927"/>
+        <w:gridCol w:w="1413"/>
       </w:tblGrid>
       <w:tr>
         <w:trPr>
@@ -8844,7 +8878,7 @@
           <w:tcPr>
             <w:shd w:val="clear" w:color="auto" w:fill="2B547E"/>
             <w:vAlign w:val="center"/>
-            <w:tcW w:type="dxa" w:w="3707"/>
+            <w:tcW w:type="dxa" w:w="3666"/>
           </w:tcPr>
           <w:p>
             <w:pPr>
@@ -8869,7 +8903,7 @@
           <w:tcPr>
             <w:shd w:val="clear" w:color="auto" w:fill="2B547E"/>
             <w:vAlign w:val="center"/>
-            <w:tcW w:type="dxa" w:w="1783"/>
+            <w:tcW w:type="dxa" w:w="1434"/>
           </w:tcPr>
           <w:p>
             <w:pPr>
@@ -8914,7 +8948,7 @@
           <w:tcPr>
             <w:shd w:val="clear" w:color="auto" w:fill="2B547E"/>
             <w:vAlign w:val="center"/>
-            <w:tcW w:type="dxa" w:w="1854"/>
+            <w:tcW w:type="dxa" w:w="1612"/>
           </w:tcPr>
           <w:p>
             <w:pPr>
@@ -8931,6 +8965,51 @@
                 <w:color w:val="FFFFFF"/>
                 <w:sz w:val="18"/>
               </w:rPr>
+              <w:t>Вид: КМ — контра / РМ — ретенциона</w:t>
+            </w:r>
+            <w:r>
+              <w:rPr>
+                <w:rFonts w:ascii="Calibri" w:hAnsi="Calibri"/>
+                <w:b w:val="0"/>
+                <w:i w:val="0"/>
+                <w:color w:val="FFFFFF"/>
+                <w:sz w:val="14"/>
+              </w:rPr>
+              <w:t xml:space="preserve"> | </w:t>
+            </w:r>
+            <w:r>
+              <w:rPr>
+                <w:rFonts w:ascii="Calibri" w:hAnsi="Calibri"/>
+                <w:b w:val="0"/>
+                <w:i w:val="0"/>
+                <w:color w:val="FFFFFF"/>
+                <w:sz w:val="14"/>
+              </w:rPr>
+              <w:t>Type: CS — counter / RS — retention</w:t>
+            </w:r>
+          </w:p>
+        </w:tc>
+        <w:tc>
+          <w:tcPr>
+            <w:shd w:val="clear" w:color="auto" w:fill="2B547E"/>
+            <w:vAlign w:val="center"/>
+            <w:tcW w:type="dxa" w:w="1413"/>
+          </w:tcPr>
+          <w:p>
+            <w:pPr>
+              <w:keepNext/>
+              <w:spacing w:before="20" w:after="20"/>
+              <w:jc w:val="center"/>
+            </w:pPr>
+            <w:r/>
+            <w:r>
+              <w:rPr>
+                <w:rFonts w:ascii="Calibri" w:hAnsi="Calibri"/>
+                <w:b/>
+                <w:i w:val="0"/>
+                <w:color w:val="FFFFFF"/>
+                <w:sz w:val="18"/>
+              </w:rPr>
               <w:t>За: К — купувач / ПМ — продавач на мало</w:t>
             </w:r>
             <w:r>
@@ -8959,7 +9038,7 @@
           <w:tcPr>
             <w:shd w:val="clear" w:color="auto" w:fill="2B547E"/>
             <w:vAlign w:val="center"/>
-            <w:tcW w:type="dxa" w:w="1266"/>
+            <w:tcW w:type="dxa" w:w="927"/>
           </w:tcPr>
           <w:p>
             <w:pPr>
@@ -9004,7 +9083,7 @@
           <w:tcPr>
             <w:shd w:val="clear" w:color="auto" w:fill="2B547E"/>
             <w:vAlign w:val="center"/>
-            <w:tcW w:type="dxa" w:w="1854"/>
+            <w:tcW w:type="dxa" w:w="1413"/>
           </w:tcPr>
           <w:p>
             <w:pPr>
@@ -9054,7 +9133,7 @@
           <w:tcPr>
             <w:shd w:val="clear" w:color="auto" w:fill="F2F2F2"/>
             <w:vAlign w:val="center"/>
-            <w:tcW w:type="dxa" w:w="3707"/>
+            <w:tcW w:type="dxa" w:w="3666"/>
           </w:tcPr>
           <w:p>
             <w:pPr>
@@ -9078,49 +9157,63 @@
         <w:tc>
           <w:tcPr>
             <w:vAlign w:val="center"/>
-            <w:tcW w:type="dxa" w:w="1783"/>
-          </w:tcPr>
-          <w:p>
-            <w:pPr>
-              <w:keepNext/>
-              <w:spacing w:before="20" w:after="20"/>
-              <w:jc w:val="center"/>
-            </w:pPr>
-            <w:r/>
-          </w:p>
-        </w:tc>
-        <w:tc>
-          <w:tcPr>
-            <w:vAlign w:val="center"/>
-            <w:tcW w:type="dxa" w:w="1854"/>
-          </w:tcPr>
-          <w:p>
-            <w:pPr>
-              <w:keepNext/>
-              <w:spacing w:before="20" w:after="20"/>
-              <w:jc w:val="center"/>
-            </w:pPr>
-            <w:r/>
-          </w:p>
-        </w:tc>
-        <w:tc>
-          <w:tcPr>
-            <w:vAlign w:val="center"/>
-            <w:tcW w:type="dxa" w:w="1266"/>
-          </w:tcPr>
-          <w:p>
-            <w:pPr>
-              <w:keepNext/>
-              <w:spacing w:before="20" w:after="20"/>
-              <w:jc w:val="center"/>
-            </w:pPr>
-            <w:r/>
-          </w:p>
-        </w:tc>
-        <w:tc>
-          <w:tcPr>
-            <w:vAlign w:val="center"/>
-            <w:tcW w:type="dxa" w:w="1854"/>
+            <w:tcW w:type="dxa" w:w="1434"/>
+          </w:tcPr>
+          <w:p>
+            <w:pPr>
+              <w:keepNext/>
+              <w:spacing w:before="20" w:after="20"/>
+              <w:jc w:val="center"/>
+            </w:pPr>
+            <w:r/>
+          </w:p>
+        </w:tc>
+        <w:tc>
+          <w:tcPr>
+            <w:vAlign w:val="center"/>
+            <w:tcW w:type="dxa" w:w="1612"/>
+          </w:tcPr>
+          <w:p>
+            <w:pPr>
+              <w:keepNext/>
+              <w:spacing w:before="20" w:after="20"/>
+              <w:jc w:val="center"/>
+            </w:pPr>
+            <w:r/>
+          </w:p>
+        </w:tc>
+        <w:tc>
+          <w:tcPr>
+            <w:vAlign w:val="center"/>
+            <w:tcW w:type="dxa" w:w="1413"/>
+          </w:tcPr>
+          <w:p>
+            <w:pPr>
+              <w:keepNext/>
+              <w:spacing w:before="20" w:after="20"/>
+              <w:jc w:val="center"/>
+            </w:pPr>
+            <w:r/>
+          </w:p>
+        </w:tc>
+        <w:tc>
+          <w:tcPr>
+            <w:vAlign w:val="center"/>
+            <w:tcW w:type="dxa" w:w="927"/>
+          </w:tcPr>
+          <w:p>
+            <w:pPr>
+              <w:keepNext/>
+              <w:spacing w:before="20" w:after="20"/>
+              <w:jc w:val="center"/>
+            </w:pPr>
+            <w:r/>
+          </w:p>
+        </w:tc>
+        <w:tc>
+          <w:tcPr>
+            <w:vAlign w:val="center"/>
+            <w:tcW w:type="dxa" w:w="1413"/>
           </w:tcPr>
           <w:p>
             <w:pPr>
@@ -9140,7 +9233,7 @@
           <w:tcPr>
             <w:shd w:val="clear" w:color="auto" w:fill="F2F2F2"/>
             <w:vAlign w:val="center"/>
-            <w:tcW w:type="dxa" w:w="3707"/>
+            <w:tcW w:type="dxa" w:w="3666"/>
           </w:tcPr>
           <w:p>
             <w:pPr>
@@ -9165,7 +9258,7 @@
           <w:tcPr>
             <w:shd w:val="clear" w:color="auto" w:fill="F7FAFC"/>
             <w:vAlign w:val="center"/>
-            <w:tcW w:type="dxa" w:w="1783"/>
+            <w:tcW w:type="dxa" w:w="1434"/>
           </w:tcPr>
           <w:p>
             <w:pPr>
@@ -9180,7 +9273,7 @@
           <w:tcPr>
             <w:shd w:val="clear" w:color="auto" w:fill="F7FAFC"/>
             <w:vAlign w:val="center"/>
-            <w:tcW w:type="dxa" w:w="1854"/>
+            <w:tcW w:type="dxa" w:w="1612"/>
           </w:tcPr>
           <w:p>
             <w:pPr>
@@ -9195,7 +9288,7 @@
           <w:tcPr>
             <w:shd w:val="clear" w:color="auto" w:fill="F7FAFC"/>
             <w:vAlign w:val="center"/>
-            <w:tcW w:type="dxa" w:w="1266"/>
+            <w:tcW w:type="dxa" w:w="1413"/>
           </w:tcPr>
           <w:p>
             <w:pPr>
@@ -9210,7 +9303,22 @@
           <w:tcPr>
             <w:shd w:val="clear" w:color="auto" w:fill="F7FAFC"/>
             <w:vAlign w:val="center"/>
-            <w:tcW w:type="dxa" w:w="1854"/>
+            <w:tcW w:type="dxa" w:w="927"/>
+          </w:tcPr>
+          <w:p>
+            <w:pPr>
+              <w:keepNext/>
+              <w:spacing w:before="20" w:after="20"/>
+              <w:jc w:val="center"/>
+            </w:pPr>
+            <w:r/>
+          </w:p>
+        </w:tc>
+        <w:tc>
+          <w:tcPr>
+            <w:shd w:val="clear" w:color="auto" w:fill="F7FAFC"/>
+            <w:vAlign w:val="center"/>
+            <w:tcW w:type="dxa" w:w="1413"/>
           </w:tcPr>
           <w:p>
             <w:pPr>
@@ -9230,7 +9338,7 @@
           <w:tcPr>
             <w:shd w:val="clear" w:color="auto" w:fill="F2F2F2"/>
             <w:vAlign w:val="center"/>
-            <w:tcW w:type="dxa" w:w="3707"/>
+            <w:tcW w:type="dxa" w:w="3666"/>
           </w:tcPr>
           <w:p>
             <w:pPr>
@@ -9254,49 +9362,63 @@
         <w:tc>
           <w:tcPr>
             <w:vAlign w:val="center"/>
-            <w:tcW w:type="dxa" w:w="1783"/>
-          </w:tcPr>
-          <w:p>
-            <w:pPr>
-              <w:keepNext/>
-              <w:spacing w:before="20" w:after="20"/>
-              <w:jc w:val="center"/>
-            </w:pPr>
-            <w:r/>
-          </w:p>
-        </w:tc>
-        <w:tc>
-          <w:tcPr>
-            <w:vAlign w:val="center"/>
-            <w:tcW w:type="dxa" w:w="1854"/>
-          </w:tcPr>
-          <w:p>
-            <w:pPr>
-              <w:keepNext/>
-              <w:spacing w:before="20" w:after="20"/>
-              <w:jc w:val="center"/>
-            </w:pPr>
-            <w:r/>
-          </w:p>
-        </w:tc>
-        <w:tc>
-          <w:tcPr>
-            <w:vAlign w:val="center"/>
-            <w:tcW w:type="dxa" w:w="1266"/>
-          </w:tcPr>
-          <w:p>
-            <w:pPr>
-              <w:keepNext/>
-              <w:spacing w:before="20" w:after="20"/>
-              <w:jc w:val="center"/>
-            </w:pPr>
-            <w:r/>
-          </w:p>
-        </w:tc>
-        <w:tc>
-          <w:tcPr>
-            <w:vAlign w:val="center"/>
-            <w:tcW w:type="dxa" w:w="1854"/>
+            <w:tcW w:type="dxa" w:w="1434"/>
+          </w:tcPr>
+          <w:p>
+            <w:pPr>
+              <w:keepNext/>
+              <w:spacing w:before="20" w:after="20"/>
+              <w:jc w:val="center"/>
+            </w:pPr>
+            <w:r/>
+          </w:p>
+        </w:tc>
+        <w:tc>
+          <w:tcPr>
+            <w:vAlign w:val="center"/>
+            <w:tcW w:type="dxa" w:w="1612"/>
+          </w:tcPr>
+          <w:p>
+            <w:pPr>
+              <w:keepNext/>
+              <w:spacing w:before="20" w:after="20"/>
+              <w:jc w:val="center"/>
+            </w:pPr>
+            <w:r/>
+          </w:p>
+        </w:tc>
+        <w:tc>
+          <w:tcPr>
+            <w:vAlign w:val="center"/>
+            <w:tcW w:type="dxa" w:w="1413"/>
+          </w:tcPr>
+          <w:p>
+            <w:pPr>
+              <w:keepNext/>
+              <w:spacing w:before="20" w:after="20"/>
+              <w:jc w:val="center"/>
+            </w:pPr>
+            <w:r/>
+          </w:p>
+        </w:tc>
+        <w:tc>
+          <w:tcPr>
+            <w:vAlign w:val="center"/>
+            <w:tcW w:type="dxa" w:w="927"/>
+          </w:tcPr>
+          <w:p>
+            <w:pPr>
+              <w:keepNext/>
+              <w:spacing w:before="20" w:after="20"/>
+              <w:jc w:val="center"/>
+            </w:pPr>
+            <w:r/>
+          </w:p>
+        </w:tc>
+        <w:tc>
+          <w:tcPr>
+            <w:vAlign w:val="center"/>
+            <w:tcW w:type="dxa" w:w="1413"/>
           </w:tcPr>
           <w:p>
             <w:pPr>
@@ -9316,7 +9438,7 @@
           <w:tcPr>
             <w:shd w:val="clear" w:color="auto" w:fill="F2F2F2"/>
             <w:vAlign w:val="center"/>
-            <w:tcW w:type="dxa" w:w="3707"/>
+            <w:tcW w:type="dxa" w:w="3666"/>
           </w:tcPr>
           <w:p>
             <w:pPr>
@@ -9341,7 +9463,7 @@
           <w:tcPr>
             <w:shd w:val="clear" w:color="auto" w:fill="F7FAFC"/>
             <w:vAlign w:val="center"/>
-            <w:tcW w:type="dxa" w:w="1783"/>
+            <w:tcW w:type="dxa" w:w="1434"/>
           </w:tcPr>
           <w:p>
             <w:pPr>
@@ -9356,7 +9478,7 @@
           <w:tcPr>
             <w:shd w:val="clear" w:color="auto" w:fill="F7FAFC"/>
             <w:vAlign w:val="center"/>
-            <w:tcW w:type="dxa" w:w="1854"/>
+            <w:tcW w:type="dxa" w:w="1612"/>
           </w:tcPr>
           <w:p>
             <w:pPr>
@@ -9371,7 +9493,7 @@
           <w:tcPr>
             <w:shd w:val="clear" w:color="auto" w:fill="F7FAFC"/>
             <w:vAlign w:val="center"/>
-            <w:tcW w:type="dxa" w:w="1266"/>
+            <w:tcW w:type="dxa" w:w="1413"/>
           </w:tcPr>
           <w:p>
             <w:pPr>
@@ -9386,7 +9508,22 @@
           <w:tcPr>
             <w:shd w:val="clear" w:color="auto" w:fill="F7FAFC"/>
             <w:vAlign w:val="center"/>
-            <w:tcW w:type="dxa" w:w="1854"/>
+            <w:tcW w:type="dxa" w:w="927"/>
+          </w:tcPr>
+          <w:p>
+            <w:pPr>
+              <w:keepNext/>
+              <w:spacing w:before="20" w:after="20"/>
+              <w:jc w:val="center"/>
+            </w:pPr>
+            <w:r/>
+          </w:p>
+        </w:tc>
+        <w:tc>
+          <w:tcPr>
+            <w:shd w:val="clear" w:color="auto" w:fill="F7FAFC"/>
+            <w:vAlign w:val="center"/>
+            <w:tcW w:type="dxa" w:w="1413"/>
           </w:tcPr>
           <w:p>
             <w:pPr>
@@ -9406,7 +9543,7 @@
           <w:tcPr>
             <w:shd w:val="clear" w:color="auto" w:fill="F2F2F2"/>
             <w:vAlign w:val="center"/>
-            <w:tcW w:type="dxa" w:w="3707"/>
+            <w:tcW w:type="dxa" w:w="3666"/>
           </w:tcPr>
           <w:p>
             <w:pPr>
@@ -9430,49 +9567,63 @@
         <w:tc>
           <w:tcPr>
             <w:vAlign w:val="center"/>
-            <w:tcW w:type="dxa" w:w="1783"/>
-          </w:tcPr>
-          <w:p>
-            <w:pPr>
-              <w:keepNext/>
-              <w:spacing w:before="20" w:after="20"/>
-              <w:jc w:val="center"/>
-            </w:pPr>
-            <w:r/>
-          </w:p>
-        </w:tc>
-        <w:tc>
-          <w:tcPr>
-            <w:vAlign w:val="center"/>
-            <w:tcW w:type="dxa" w:w="1854"/>
-          </w:tcPr>
-          <w:p>
-            <w:pPr>
-              <w:keepNext/>
-              <w:spacing w:before="20" w:after="20"/>
-              <w:jc w:val="center"/>
-            </w:pPr>
-            <w:r/>
-          </w:p>
-        </w:tc>
-        <w:tc>
-          <w:tcPr>
-            <w:vAlign w:val="center"/>
-            <w:tcW w:type="dxa" w:w="1266"/>
-          </w:tcPr>
-          <w:p>
-            <w:pPr>
-              <w:keepNext/>
-              <w:spacing w:before="20" w:after="20"/>
-              <w:jc w:val="center"/>
-            </w:pPr>
-            <w:r/>
-          </w:p>
-        </w:tc>
-        <w:tc>
-          <w:tcPr>
-            <w:vAlign w:val="center"/>
-            <w:tcW w:type="dxa" w:w="1854"/>
+            <w:tcW w:type="dxa" w:w="1434"/>
+          </w:tcPr>
+          <w:p>
+            <w:pPr>
+              <w:keepNext/>
+              <w:spacing w:before="20" w:after="20"/>
+              <w:jc w:val="center"/>
+            </w:pPr>
+            <w:r/>
+          </w:p>
+        </w:tc>
+        <w:tc>
+          <w:tcPr>
+            <w:vAlign w:val="center"/>
+            <w:tcW w:type="dxa" w:w="1612"/>
+          </w:tcPr>
+          <w:p>
+            <w:pPr>
+              <w:keepNext/>
+              <w:spacing w:before="20" w:after="20"/>
+              <w:jc w:val="center"/>
+            </w:pPr>
+            <w:r/>
+          </w:p>
+        </w:tc>
+        <w:tc>
+          <w:tcPr>
+            <w:vAlign w:val="center"/>
+            <w:tcW w:type="dxa" w:w="1413"/>
+          </w:tcPr>
+          <w:p>
+            <w:pPr>
+              <w:keepNext/>
+              <w:spacing w:before="20" w:after="20"/>
+              <w:jc w:val="center"/>
+            </w:pPr>
+            <w:r/>
+          </w:p>
+        </w:tc>
+        <w:tc>
+          <w:tcPr>
+            <w:vAlign w:val="center"/>
+            <w:tcW w:type="dxa" w:w="927"/>
+          </w:tcPr>
+          <w:p>
+            <w:pPr>
+              <w:keepNext/>
+              <w:spacing w:before="20" w:after="20"/>
+              <w:jc w:val="center"/>
+            </w:pPr>
+            <w:r/>
+          </w:p>
+        </w:tc>
+        <w:tc>
+          <w:tcPr>
+            <w:vAlign w:val="center"/>
+            <w:tcW w:type="dxa" w:w="1413"/>
           </w:tcPr>
           <w:p>
             <w:pPr>
@@ -9492,7 +9643,7 @@
           <w:tcPr>
             <w:shd w:val="clear" w:color="auto" w:fill="F2F2F2"/>
             <w:vAlign w:val="center"/>
-            <w:tcW w:type="dxa" w:w="3707"/>
+            <w:tcW w:type="dxa" w:w="3666"/>
           </w:tcPr>
           <w:p>
             <w:pPr>
@@ -9517,7 +9668,7 @@
           <w:tcPr>
             <w:shd w:val="clear" w:color="auto" w:fill="F7FAFC"/>
             <w:vAlign w:val="center"/>
-            <w:tcW w:type="dxa" w:w="1783"/>
+            <w:tcW w:type="dxa" w:w="1434"/>
           </w:tcPr>
           <w:p>
             <w:pPr>
@@ -9532,7 +9683,7 @@
           <w:tcPr>
             <w:shd w:val="clear" w:color="auto" w:fill="F7FAFC"/>
             <w:vAlign w:val="center"/>
-            <w:tcW w:type="dxa" w:w="1854"/>
+            <w:tcW w:type="dxa" w:w="1612"/>
           </w:tcPr>
           <w:p>
             <w:pPr>
@@ -9547,7 +9698,7 @@
           <w:tcPr>
             <w:shd w:val="clear" w:color="auto" w:fill="F7FAFC"/>
             <w:vAlign w:val="center"/>
-            <w:tcW w:type="dxa" w:w="1266"/>
+            <w:tcW w:type="dxa" w:w="1413"/>
           </w:tcPr>
           <w:p>
             <w:pPr>
@@ -9562,7 +9713,22 @@
           <w:tcPr>
             <w:shd w:val="clear" w:color="auto" w:fill="F7FAFC"/>
             <w:vAlign w:val="center"/>
-            <w:tcW w:type="dxa" w:w="1854"/>
+            <w:tcW w:type="dxa" w:w="927"/>
+          </w:tcPr>
+          <w:p>
+            <w:pPr>
+              <w:keepNext/>
+              <w:spacing w:before="20" w:after="20"/>
+              <w:jc w:val="center"/>
+            </w:pPr>
+            <w:r/>
+          </w:p>
+        </w:tc>
+        <w:tc>
+          <w:tcPr>
+            <w:shd w:val="clear" w:color="auto" w:fill="F7FAFC"/>
+            <w:vAlign w:val="center"/>
+            <w:tcW w:type="dxa" w:w="1413"/>
           </w:tcPr>
           <w:p>
             <w:pPr>
@@ -9582,7 +9748,7 @@
           <w:tcPr>
             <w:shd w:val="clear" w:color="auto" w:fill="F2F2F2"/>
             <w:vAlign w:val="center"/>
-            <w:tcW w:type="dxa" w:w="3707"/>
+            <w:tcW w:type="dxa" w:w="3666"/>
           </w:tcPr>
           <w:p>
             <w:pPr>
@@ -9625,46 +9791,59 @@
         <w:tc>
           <w:tcPr>
             <w:vAlign w:val="center"/>
-            <w:tcW w:type="dxa" w:w="1783"/>
-          </w:tcPr>
-          <w:p>
-            <w:pPr>
-              <w:spacing w:before="20" w:after="20"/>
-              <w:jc w:val="center"/>
-            </w:pPr>
-            <w:r/>
-          </w:p>
-        </w:tc>
-        <w:tc>
-          <w:tcPr>
-            <w:vAlign w:val="center"/>
-            <w:tcW w:type="dxa" w:w="1854"/>
-          </w:tcPr>
-          <w:p>
-            <w:pPr>
-              <w:spacing w:before="20" w:after="20"/>
-              <w:jc w:val="center"/>
-            </w:pPr>
-            <w:r/>
-          </w:p>
-        </w:tc>
-        <w:tc>
-          <w:tcPr>
-            <w:vAlign w:val="center"/>
-            <w:tcW w:type="dxa" w:w="1266"/>
-          </w:tcPr>
-          <w:p>
-            <w:pPr>
-              <w:spacing w:before="20" w:after="20"/>
-              <w:jc w:val="center"/>
-            </w:pPr>
-            <w:r/>
-          </w:p>
-        </w:tc>
-        <w:tc>
-          <w:tcPr>
-            <w:vAlign w:val="center"/>
-            <w:tcW w:type="dxa" w:w="1854"/>
+            <w:tcW w:type="dxa" w:w="1434"/>
+          </w:tcPr>
+          <w:p>
+            <w:pPr>
+              <w:spacing w:before="20" w:after="20"/>
+              <w:jc w:val="center"/>
+            </w:pPr>
+            <w:r/>
+          </w:p>
+        </w:tc>
+        <w:tc>
+          <w:tcPr>
+            <w:vAlign w:val="center"/>
+            <w:tcW w:type="dxa" w:w="1612"/>
+          </w:tcPr>
+          <w:p>
+            <w:pPr>
+              <w:spacing w:before="20" w:after="20"/>
+              <w:jc w:val="center"/>
+            </w:pPr>
+            <w:r/>
+          </w:p>
+        </w:tc>
+        <w:tc>
+          <w:tcPr>
+            <w:vAlign w:val="center"/>
+            <w:tcW w:type="dxa" w:w="1413"/>
+          </w:tcPr>
+          <w:p>
+            <w:pPr>
+              <w:spacing w:before="20" w:after="20"/>
+              <w:jc w:val="center"/>
+            </w:pPr>
+            <w:r/>
+          </w:p>
+        </w:tc>
+        <w:tc>
+          <w:tcPr>
+            <w:vAlign w:val="center"/>
+            <w:tcW w:type="dxa" w:w="927"/>
+          </w:tcPr>
+          <w:p>
+            <w:pPr>
+              <w:spacing w:before="20" w:after="20"/>
+              <w:jc w:val="center"/>
+            </w:pPr>
+            <w:r/>
+          </w:p>
+        </w:tc>
+        <w:tc>
+          <w:tcPr>
+            <w:vAlign w:val="center"/>
+            <w:tcW w:type="dxa" w:w="1413"/>
           </w:tcPr>
           <w:p>
             <w:pPr>
@@ -9788,7 +9967,7 @@
                 <w:color w:val="000000"/>
                 <w:sz w:val="20"/>
               </w:rPr>
-              <w:t>Спојот на лентата парафиран и датиран од двете лица</w:t>
+              <w:t>Брендирана лента; спојот парафиран и датиран од двете лица</w:t>
             </w:r>
             <w:r>
               <w:rPr>
@@ -9808,7 +9987,7 @@
                 <w:color w:val="000000"/>
                 <w:sz w:val="16"/>
               </w:rPr>
-              <w:t>Tape joint initialled and dated by both persons</w:t>
+              <w:t>Branded tape; joint initialled and dated by both persons</w:t>
             </w:r>
           </w:p>
         </w:tc>
@@ -9882,7 +10061,7 @@
                 <w:color w:val="000000"/>
                 <w:sz w:val="20"/>
               </w:rPr>
-              <w:t>Етикетата „КОНТРА-МОСТРИ“ поставена на картонот</w:t>
+              <w:t>Етикетата „КОНТРА МОСТРИ“ поставена на картонот</w:t>
             </w:r>
             <w:r>
               <w:rPr>

</xml_diff>